<commit_message>
fix: update model 31 outpsts
</commit_message>
<xml_diff>
--- a/outputs/a31/a31_ficha_funcional.docx
+++ b/outputs/a31/a31_ficha_funcional.docx
@@ -468,7 +468,7 @@
           </w:tcPr>
           <w:p ns2:paraId="4F17D729" ns2:textId="77777777">
             <w:r>
-              <w:t xml:space="preserve">Herramienta de apoyo para el cultivo de cereal que estima cuánta biomasa vegetal (los restos de la planta, principalmente paja) quedaría disponible en el suelo tras la cosecha de una explotación, expresada en toneladas. A partir de la superficie sembrada, la lluvia de primavera, si ha habido o no sequía y el tipo de cultivo, la herramienta calcula el volumen de residuo esperado. Es un paso previo para decidir cómo gestionar ese residuo, no la decisión en sí.</w:t>
+              <w:t xml:space="preserve">Herramienta de apoyo a la decisión que propone cómo repartir la superficie de cultivos cerealistas (entre secano y regadío) para reducir la cantidad de residuo vegetal que queda en el suelo, sin perder beneficio económico. A partir de la situación de un año, calcula un plan alternativo de siembra y te dice cuánto residuo ahorrarías y qué beneficio mantendrías.</w:t>
             </w:r>
           </w:p>
         </w:tc>
@@ -523,7 +523,7 @@
           </w:tcPr>
           <w:p ns2:paraId="1ED00FCD" ns2:textId="77777777">
             <w:r>
-              <w:t xml:space="preserve">Ayudar a las explotaciones cerealistas a conocer por adelantado cuánto residuo vegetal va a quedar en el campo, para poder planificar su gestión (retirada, aprovechamiento o venta) y avanzar hacia el objetivo del proyecto: reducir el residuo excedentario sin perder rentabilidad. La herramienta aporta la estimación del residuo; la decisión de qué cultivar y dónde queda en manos del técnico.</w:t>
+              <w:t xml:space="preserve">Ayudar a planificar la distribución de cultivos de forma que se genere menos biomasa residual manteniendo la rentabilidad de la explotación. Busca un mejor equilibrio entre sostenibilidad (menos residuo) y economía (mismo beneficio), respetando límites realistas de cuánto se puede cambiar la superficie de cada cultivo.</w:t>
             </w:r>
           </w:p>
         </w:tc>
@@ -578,7 +578,7 @@
           </w:tcPr>
           <w:p ns2:paraId="40956F30" ns2:textId="77777777">
             <w:r>
-              <w:t xml:space="preserve">Introduces los datos de un escenario de cultivo (cuántas hectáreas en secano y en regadío, la lluvia de primavera, si es un año de sequía y qué cultivo es) y la herramienta te devuelve las toneladas de residuo que cabe esperar en el suelo. Puedes consultar un escenario suelto o cargar una tabla con muchos escenarios de golpe y obtener una estimación para cada uno.</w:t>
+              <w:t xml:space="preserve">Indicas el año de referencia y, si quieres, ajustes como la lluvia esperada o cuánto beneficio quieres preservar como mínimo. La herramienta te devuelve un plan de reparto de superficies por cultivo, cuánto residuo se reduce y qué pasa con el beneficio y la producción. También puede dibujar el abanico de opciones posibles (desde 'máximo ahorro de residuo' hasta 'máximo beneficio') para que elijas el punto de equilibrio que prefieras, o analizar varios escenarios de golpe. No aprende de tus datos: es un cálculo de optimización, no una predicción.</w:t>
             </w:r>
           </w:p>
         </w:tc>
@@ -613,7 +613,7 @@
         <w:jc w:val="both"/>
       </w:pPr>
       <w:r>
-        <w:t xml:space="preserve">No te dice qué cultivo plantar ni cómo repartir la superficie para reducir el residuo, ni calcula el beneficio económico o un plan de acción. Solo estima cuánto residuo quedará en el escenario que le describes.</w:t>
+        <w:t xml:space="preserve">No predice precios, cosechas ni el clima futuro, ni garantiza el resultado económico real: propone un reparto de cultivos teórico bajo las condiciones y los precios que le indiques.</w:t>
       </w:r>
     </w:p>
     <w:p ns2:paraId="0B3A0E33" ns2:textId="77777777"/>
@@ -633,7 +633,7 @@
         <w:jc w:val="both"/>
       </w:pPr>
       <w:r>
-        <w:t xml:space="preserve">Los datos que pide provienen de la propia planificación de la explotación (superficie prevista por cultivo y régimen) y de datos meteorológicos de la campaña (lluvia de primavera). El indicador de sequía se puede deducir directamente de esa lluvia.</w:t>
+        <w:t xml:space="preserve">Parte de los datos históricos de superficies y rendimientos de cultivos cerealistas de Castilla y León (2009–2023) y de un modelo económico de precios y costes por cultivo. Tú solo aportas el escenario (año de referencia y, opcionalmente, ajustes de clima, lluvia o restricciones).</w:t>
       </w:r>
     </w:p>
     <w:p ns2:paraId="6D2C7225" ns2:textId="77777777"/>
@@ -741,7 +741,7 @@
           </w:tcPr>
           <w:p ns2:paraId="02741774" ns2:textId="77777777">
             <w:r>
-              <w:t xml:space="preserve">Superficie en secano</w:t>
+              <w:t xml:space="preserve">Año de referencia</w:t>
             </w:r>
           </w:p>
         </w:tc>
@@ -764,7 +764,7 @@
           </w:tcPr>
           <w:p ns2:paraId="3AB481B3" ns2:textId="77777777">
             <w:r>
-              <w:t xml:space="preserve">Hectáreas de ese cultivo que se van a sembrar en secano.</w:t>
+              <w:t xml:space="preserve">El año cuya distribución de cultivos se toma como punto de partida para proponer mejoras.</w:t>
             </w:r>
           </w:p>
         </w:tc>
@@ -789,7 +789,7 @@
           </w:tcPr>
           <w:p ns2:paraId="02741774" ns2:textId="77777777">
             <w:r>
-              <w:t xml:space="preserve">Superficie en regadío</w:t>
+              <w:t xml:space="preserve">Objetivo</w:t>
             </w:r>
           </w:p>
         </w:tc>
@@ -812,7 +812,7 @@
           </w:tcPr>
           <w:p ns2:paraId="3AB481B3" ns2:textId="77777777">
             <w:r>
-              <w:t xml:space="preserve">Hectáreas de ese cultivo que se van a sembrar en regadío.</w:t>
+              <w:t xml:space="preserve">Qué priorizar: reducir al máximo el residuo (manteniendo un beneficio mínimo) o maximizar el beneficio (sin pasar de un residuo máximo).</w:t>
             </w:r>
           </w:p>
         </w:tc>
@@ -837,7 +837,7 @@
           </w:tcPr>
           <w:p ns2:paraId="02741774" ns2:textId="77777777">
             <w:r>
-              <w:t xml:space="preserve">Lluvia de primavera</w:t>
+              <w:t xml:space="preserve">Ajustes del escenario (opcionales)</w:t>
             </w:r>
           </w:p>
         </w:tc>
@@ -860,7 +860,7 @@
           </w:tcPr>
           <w:p ns2:paraId="3AB481B3" ns2:textId="77777777">
             <w:r>
-              <w:t xml:space="preserve">Lluvia acumulada durante la primavera (marzo a mayo), en milímetros.</w:t>
+              <w:t xml:space="preserve">Lluvia de primavera esperada, factor de clima, beneficio mínimo a preservar y cuánto se permite variar la superficie de cada cultivo.</w:t>
             </w:r>
           </w:p>
         </w:tc>
@@ -885,7 +885,7 @@
           </w:tcPr>
           <w:p ns2:paraId="02741774" ns2:textId="77777777">
             <w:r>
-              <w:t xml:space="preserve">Año de sequía</w:t>
+              <w:t xml:space="preserve">Precios y costes (opcionales)</w:t>
             </w:r>
           </w:p>
         </w:tc>
@@ -908,7 +908,7 @@
           </w:tcPr>
           <w:p ns2:paraId="3AB481B3" ns2:textId="77777777">
             <w:r>
-              <w:t xml:space="preserve">Indicación de si la primavera fue seca: se marca cuando la lluvia de primavera queda por debajo de 200 mm. Si no se indica, se asume que no hubo sequía.</w:t>
+              <w:t xml:space="preserve">Puedes sobrescribir los precios de venta y los costes por cultivo si quieres usar cifras actualizadas.</w:t>
             </w:r>
           </w:p>
         </w:tc>
@@ -933,7 +933,7 @@
           </w:tcPr>
           <w:p ns2:paraId="02741774" ns2:textId="77777777">
             <w:r>
-              <w:t xml:space="preserve">Tipo de cultivo</w:t>
+              <w:t xml:space="preserve">Conjunto de escenarios</w:t>
             </w:r>
           </w:p>
         </w:tc>
@@ -956,55 +956,7 @@
           </w:tcPr>
           <w:p ns2:paraId="3AB481B3" ns2:textId="77777777">
             <w:r>
-              <w:t xml:space="preserve">El cultivo cerealista del escenario (por ejemplo trigo, cebada, maíz o girasol).</w:t>
-            </w:r>
-          </w:p>
-        </w:tc>
-      </w:tr>
-      <w:tr ns2:paraId="39E09196" ns2:textId="77777777">
-        <w:tc>
-          <w:tcPr>
-            <w:tcW w:w="2167" w:type="dxa"/>
-            <w:tcBorders>
-              <w:top w:val="single" w:sz="4" w:space="0" w:color="BFCFDF"/>
-              <w:left w:val="single" w:sz="4" w:space="0" w:color="BFCFDF"/>
-              <w:bottom w:val="single" w:sz="4" w:space="0" w:color="BFCFDF"/>
-              <w:right w:val="single" w:sz="4" w:space="0" w:color="BFCFDF"/>
-            </w:tcBorders>
-            <w:shd w:val="clear" w:color="auto" w:fill="EBF3FB"/>
-            <w:tcMar>
-              <w:top w:w="80" w:type="dxa"/>
-              <w:left w:w="120" w:type="dxa"/>
-              <w:bottom w:w="80" w:type="dxa"/>
-              <w:right w:w="120" w:type="dxa"/>
-            </w:tcMar>
-          </w:tcPr>
-          <w:p ns2:paraId="02741774" ns2:textId="77777777">
-            <w:r>
-              <w:t xml:space="preserve">Tabla de escenarios (uso por lotes)</w:t>
-            </w:r>
-          </w:p>
-        </w:tc>
-        <w:tc>
-          <w:tcPr>
-            <w:tcW w:w="3055" w:type="dxa"/>
-            <w:tcBorders>
-              <w:top w:val="single" w:sz="4" w:space="0" w:color="BFCFDF"/>
-              <w:left w:val="single" w:sz="4" w:space="0" w:color="BFCFDF"/>
-              <w:bottom w:val="single" w:sz="4" w:space="0" w:color="BFCFDF"/>
-              <w:right w:val="single" w:sz="4" w:space="0" w:color="BFCFDF"/>
-            </w:tcBorders>
-            <w:shd w:val="clear" w:color="auto" w:fill="EBF3FB"/>
-            <w:tcMar>
-              <w:top w:w="80" w:type="dxa"/>
-              <w:left w:w="120" w:type="dxa"/>
-              <w:bottom w:w="80" w:type="dxa"/>
-              <w:right w:w="120" w:type="dxa"/>
-            </w:tcMar>
-          </w:tcPr>
-          <w:p ns2:paraId="3AB481B3" ns2:textId="77777777">
-            <w:r>
-              <w:t xml:space="preserve">Un fichero con varias filas, cada una con los datos de un escenario, para obtener la estimación de todos de una sola vez.</w:t>
+              <w:t xml:space="preserve">Un fichero con varios escenarios para calcularlos todos de una vez.</w:t>
             </w:r>
           </w:p>
         </w:tc>
@@ -1181,7 +1133,7 @@
           </w:tcPr>
           <w:p ns2:paraId="2CD654FD" ns2:textId="77777777">
             <w:r>
-              <w:t xml:space="preserve">Residuo estimado (toneladas)</w:t>
+              <w:t xml:space="preserve">Plan de reparto de cultivos</w:t>
             </w:r>
           </w:p>
         </w:tc>
@@ -1204,7 +1156,7 @@
           </w:tcPr>
           <w:p ns2:paraId="35872DC0" ns2:textId="77777777">
             <w:r>
-              <w:t xml:space="preserve">Las toneladas de biomasa vegetal que se calcula que quedarían disponibles en el suelo tras la cosecha del escenario descrito.</w:t>
+              <w:t xml:space="preserve">Cuánta superficie dedicar a cada cultivo en secano y en regadío en la propuesta óptima.</w:t>
             </w:r>
           </w:p>
         </w:tc>
@@ -1227,7 +1179,7 @@
           </w:tcPr>
           <w:p ns2:paraId="1DF2EF4D" ns2:textId="77777777">
             <w:r>
-              <w:t xml:space="preserve">Cuanto mayor es la cifra, más residuo habrá que gestionar; sirve para anticipar el excedente y planificar su retirada o aprovechamiento.</w:t>
+              <w:t xml:space="preserve">Es la recomendación práctica de siembra para ese escenario.</w:t>
             </w:r>
           </w:p>
         </w:tc>
@@ -1252,7 +1204,7 @@
           </w:tcPr>
           <w:p ns2:paraId="2CD654FD" ns2:textId="77777777">
             <w:r>
-              <w:t xml:space="preserve">Detalle de los datos usados</w:t>
+              <w:t xml:space="preserve">Residuo y ahorro</w:t>
             </w:r>
           </w:p>
         </w:tc>
@@ -1275,7 +1227,7 @@
           </w:tcPr>
           <w:p ns2:paraId="35872DC0" ns2:textId="77777777">
             <w:r>
-              <w:t xml:space="preserve">El resumen de los valores numéricos que se han tenido en cuenta para hacer la estimación.</w:t>
+              <w:t xml:space="preserve">El residuo total del plan y cuánto se reduce respecto a la situación de partida.</w:t>
             </w:r>
           </w:p>
         </w:tc>
@@ -1298,7 +1250,149 @@
           </w:tcPr>
           <w:p ns2:paraId="1DF2EF4D" ns2:textId="77777777">
             <w:r>
-              <w:t xml:space="preserve">Permite comprobar de un vistazo con qué datos se ha calculado el resultado.</w:t>
+              <w:t xml:space="preserve">Cuanto mayor el ahorro, mejor para la sostenibilidad; en el año 2023 el ahorro fue del 31%.</w:t>
+            </w:r>
+          </w:p>
+        </w:tc>
+      </w:tr>
+      <w:tr ns2:paraId="0BD31A91" ns2:textId="77777777">
+        <w:tc>
+          <w:tcPr>
+            <w:tcW w:w="2200" w:type="dxa"/>
+            <w:tcBorders>
+              <w:top w:val="single" w:sz="4" w:space="0" w:color="BFCFDF"/>
+              <w:left w:val="single" w:sz="4" w:space="0" w:color="BFCFDF"/>
+              <w:bottom w:val="single" w:sz="4" w:space="0" w:color="BFCFDF"/>
+              <w:right w:val="single" w:sz="4" w:space="0" w:color="BFCFDF"/>
+            </w:tcBorders>
+            <w:shd w:val="clear" w:color="auto" w:fill="EBF3FB"/>
+            <w:tcMar>
+              <w:top w:w="80" w:type="dxa"/>
+              <w:left w:w="120" w:type="dxa"/>
+              <w:bottom w:w="80" w:type="dxa"/>
+              <w:right w:w="120" w:type="dxa"/>
+            </w:tcMar>
+          </w:tcPr>
+          <w:p ns2:paraId="2CD654FD" ns2:textId="77777777">
+            <w:r>
+              <w:t xml:space="preserve">Beneficio y producción</w:t>
+            </w:r>
+          </w:p>
+        </w:tc>
+        <w:tc>
+          <w:tcPr>
+            <w:tcW w:w="2400" w:type="dxa"/>
+            <w:tcBorders>
+              <w:top w:val="single" w:sz="4" w:space="0" w:color="BFCFDF"/>
+              <w:left w:val="single" w:sz="4" w:space="0" w:color="BFCFDF"/>
+              <w:bottom w:val="single" w:sz="4" w:space="0" w:color="BFCFDF"/>
+              <w:right w:val="single" w:sz="4" w:space="0" w:color="BFCFDF"/>
+            </w:tcBorders>
+            <w:shd w:val="clear" w:color="auto" w:fill="EBF3FB"/>
+            <w:tcMar>
+              <w:top w:w="80" w:type="dxa"/>
+              <w:left w:w="120" w:type="dxa"/>
+              <w:bottom w:w="80" w:type="dxa"/>
+              <w:right w:w="120" w:type="dxa"/>
+            </w:tcMar>
+          </w:tcPr>
+          <w:p ns2:paraId="35872DC0" ns2:textId="77777777">
+            <w:r>
+              <w:t xml:space="preserve">El beneficio económico del plan y cómo cambia la producción respecto al punto de partida.</w:t>
+            </w:r>
+          </w:p>
+        </w:tc>
+        <w:tc>
+          <w:tcPr>
+            <w:tcW w:w="1800" w:type="dxa"/>
+            <w:tcBorders>
+              <w:top w:val="single" w:sz="4" w:space="0" w:color="BFCFDF"/>
+              <w:left w:val="single" w:sz="4" w:space="0" w:color="BFCFDF"/>
+              <w:bottom w:val="single" w:sz="4" w:space="0" w:color="BFCFDF"/>
+              <w:right w:val="single" w:sz="4" w:space="0" w:color="BFCFDF"/>
+            </w:tcBorders>
+            <w:shd w:val="clear" w:color="auto" w:fill="EBF3FB"/>
+            <w:tcMar>
+              <w:top w:w="80" w:type="dxa"/>
+              <w:left w:w="120" w:type="dxa"/>
+              <w:bottom w:w="80" w:type="dxa"/>
+              <w:right w:w="120" w:type="dxa"/>
+            </w:tcMar>
+          </w:tcPr>
+          <w:p ns2:paraId="1DF2EF4D" ns2:textId="77777777">
+            <w:r>
+              <w:t xml:space="preserve">Sirve de control: el beneficio no debe bajar del mínimo que fijaste.</w:t>
+            </w:r>
+          </w:p>
+        </w:tc>
+      </w:tr>
+      <w:tr ns2:paraId="0BD31A91" ns2:textId="77777777">
+        <w:tc>
+          <w:tcPr>
+            <w:tcW w:w="2200" w:type="dxa"/>
+            <w:tcBorders>
+              <w:top w:val="single" w:sz="4" w:space="0" w:color="BFCFDF"/>
+              <w:left w:val="single" w:sz="4" w:space="0" w:color="BFCFDF"/>
+              <w:bottom w:val="single" w:sz="4" w:space="0" w:color="BFCFDF"/>
+              <w:right w:val="single" w:sz="4" w:space="0" w:color="BFCFDF"/>
+            </w:tcBorders>
+            <w:shd w:val="clear" w:color="auto" w:fill="EBF3FB"/>
+            <w:tcMar>
+              <w:top w:w="80" w:type="dxa"/>
+              <w:left w:w="120" w:type="dxa"/>
+              <w:bottom w:w="80" w:type="dxa"/>
+              <w:right w:w="120" w:type="dxa"/>
+            </w:tcMar>
+          </w:tcPr>
+          <w:p ns2:paraId="2CD654FD" ns2:textId="77777777">
+            <w:r>
+              <w:t xml:space="preserve">Abanico de opciones</w:t>
+            </w:r>
+          </w:p>
+        </w:tc>
+        <w:tc>
+          <w:tcPr>
+            <w:tcW w:w="2400" w:type="dxa"/>
+            <w:tcBorders>
+              <w:top w:val="single" w:sz="4" w:space="0" w:color="BFCFDF"/>
+              <w:left w:val="single" w:sz="4" w:space="0" w:color="BFCFDF"/>
+              <w:bottom w:val="single" w:sz="4" w:space="0" w:color="BFCFDF"/>
+              <w:right w:val="single" w:sz="4" w:space="0" w:color="BFCFDF"/>
+            </w:tcBorders>
+            <w:shd w:val="clear" w:color="auto" w:fill="EBF3FB"/>
+            <w:tcMar>
+              <w:top w:w="80" w:type="dxa"/>
+              <w:left w:w="120" w:type="dxa"/>
+              <w:bottom w:w="80" w:type="dxa"/>
+              <w:right w:w="120" w:type="dxa"/>
+            </w:tcMar>
+          </w:tcPr>
+          <w:p ns2:paraId="35872DC0" ns2:textId="77777777">
+            <w:r>
+              <w:t xml:space="preserve">El conjunto de planes posibles entre 'máximo ahorro de residuo' y 'máximo beneficio', con el punto de mejor equilibrio destacado.</w:t>
+            </w:r>
+          </w:p>
+        </w:tc>
+        <w:tc>
+          <w:tcPr>
+            <w:tcW w:w="1800" w:type="dxa"/>
+            <w:tcBorders>
+              <w:top w:val="single" w:sz="4" w:space="0" w:color="BFCFDF"/>
+              <w:left w:val="single" w:sz="4" w:space="0" w:color="BFCFDF"/>
+              <w:bottom w:val="single" w:sz="4" w:space="0" w:color="BFCFDF"/>
+              <w:right w:val="single" w:sz="4" w:space="0" w:color="BFCFDF"/>
+            </w:tcBorders>
+            <w:shd w:val="clear" w:color="auto" w:fill="EBF3FB"/>
+            <w:tcMar>
+              <w:top w:w="80" w:type="dxa"/>
+              <w:left w:w="120" w:type="dxa"/>
+              <w:bottom w:w="80" w:type="dxa"/>
+              <w:right w:w="120" w:type="dxa"/>
+            </w:tcMar>
+          </w:tcPr>
+          <w:p ns2:paraId="1DF2EF4D" ns2:textId="77777777">
+            <w:r>
+              <w:t xml:space="preserve">Te permite elegir el compromiso que prefieras entre sostenibilidad y economía.</w:t>
             </w:r>
           </w:p>
         </w:tc>
@@ -1344,7 +1438,7 @@
         <w:jc w:val="both"/>
       </w:pPr>
       <w:r>
-        <w:t xml:space="preserve">Si para un escenario de trigo con una superficie determinada y una primavera lluviosa la herramienta estima 12.000 toneladas de residuo, se interpreta como el volumen de paja y restos que quedaría en el suelo esa campaña; ese dato ayuda a dimensionar por adelantado la logística de retirada o el aprovechamiento del residuo. En un año marcado como de sequía, para la misma superficie la estimación será menor, porque la planta genera menos biomasa.</w:t>
+        <w:t xml:space="preserve">Para el año 2023, la herramienta propone un reparto que reduce el residuo en un 31% (de unos 6,5 a 4,5 millones de toneladas) manteniendo prácticamente el mismo beneficio (diferencia inferior a 1 euro), a cambio de una bajada de producción del 5%. Se interpreta como: 'es posible generar casi un tercio menos de residuo sin perder rentabilidad, sacrificando algo de volumen de cosecha'.</w:t>
       </w:r>
     </w:p>
     <w:p ns2:paraId="7585C801" ns2:textId="77777777">
@@ -1357,7 +1451,7 @@
         <w:jc w:val="both"/>
       </w:pPr>
       <w:r>
-        <w:t xml:space="preserve">La herramienta no viene acompañada de una medida de su margen de error: en la documentación de entrega no se aporta ninguna cifra que indique cuánto se puede desviar la estimación de la realidad. Por eso sus resultados deben tomarse como una orientación y no como una cifra exacta, y conviene contrastarlos con la experiencia de campo antes de tomar decisiones sobre ellos.</w:t>
+        <w:t xml:space="preserve">El resultado es un cálculo exacto para las condiciones y precios que le des; no tiene error estadístico como un modelo que predice. Su fiabilidad depende de que los precios, costes y datos de superficie sean realistas: con cifras desactualizadas, el plan propuesto puede no reflejar la situación real de la explotación.</w:t>
       </w:r>
     </w:p>
     <w:p ns2:paraId="23429964" ns2:textId="77777777"/>
@@ -1374,17 +1468,22 @@
     </w:p>
     <w:p ns2:paraId="2053022C" ns2:textId="77777777">
       <w:r>
-        <w:t xml:space="preserve">•  Escenarios fuera de lo habitual en Castilla y León (otras zonas, cultivos poco frecuentes o superficies muy grandes o muy pequeñas), donde la estimación es menos fiable.</w:t>
+        <w:t xml:space="preserve">•  Revisa que los precios y costes por cultivo estén actualizados antes de usar el plan; son la base del cálculo económico.</w:t>
       </w:r>
     </w:p>
     <w:p ns2:paraId="2053022C" ns2:textId="77777777">
       <w:r>
-        <w:t xml:space="preserve">•  Años con condiciones extremas de lluvia o sequía, en los que conviene contrastar la cifra con la experiencia de campo.</w:t>
+        <w:t xml:space="preserve">•  Si la herramienta no encuentra solución, alguna restricción es incompatible (p. ej. exigir demasiado beneficio y muy poco cambio de superficie a la vez): relaja alguna condición.</w:t>
       </w:r>
     </w:p>
     <w:p ns2:paraId="2053022C" ns2:textId="77777777">
       <w:r>
-        <w:t xml:space="preserve">•  Cualquier decisión de inversión o de gestión importante basada en el residuo estimado: al no conocerse el margen de error, conviene validar antes con datos reales de la explotación.</w:t>
+        <w:t xml:space="preserve">•  Contrasta el plan propuesto con criterios agronómicos (rotación, suelo, agua disponible) que la herramienta no contempla.</w:t>
+      </w:r>
+    </w:p>
+    <w:p ns2:paraId="2053022C" ns2:textId="77777777">
+      <w:r>
+        <w:t xml:space="preserve">•  El plan es para cultivos cerealistas de Castilla y León; fuera de ese ámbito no es válido.</w:t>
       </w:r>
     </w:p>
     <w:p ns2:paraId="04A0CF39" ns2:textId="77777777"/>
@@ -1402,27 +1501,27 @@
     </w:p>
     <w:p ns2:paraId="36E72011" ns2:textId="77777777">
       <w:r>
-        <w:t xml:space="preserve">•  No decide cómo repartir la superficie entre cultivos ni propone un plan de acción.</w:t>
+        <w:t xml:space="preserve">•  No predice el precio del grano ni la cosecha futura.</w:t>
       </w:r>
     </w:p>
     <w:p ns2:paraId="36E72011" ns2:textId="77777777">
       <w:r>
-        <w:t xml:space="preserve">•  No calcula el beneficio económico ni compara escenarios entre sí.</w:t>
+        <w:t xml:space="preserve">•  No decide por ti: propone un plan que debes validar con criterio agronómico y de mercado.</w:t>
       </w:r>
     </w:p>
     <w:p ns2:paraId="36E72011" ns2:textId="77777777">
       <w:r>
-        <w:t xml:space="preserve">•  No mide el residuo real en el campo: lo estima a partir de los datos que le das.</w:t>
+        <w:t xml:space="preserve">•  No tiene en cuenta rotaciones de cultivo, tipo de suelo ni disponibilidad real de agua.</w:t>
       </w:r>
     </w:p>
     <w:p ns2:paraId="36E72011" ns2:textId="77777777">
       <w:r>
-        <w:t xml:space="preserve">•  No garantiza una cifra exacta: es una estimación de apoyo a la decisión.</w:t>
+        <w:t xml:space="preserve">•  No aprende ni se ajusta con tus datos: es un cálculo de optimización determinista.</w:t>
       </w:r>
     </w:p>
     <w:p ns2:paraId="36E72011" ns2:textId="77777777">
       <w:r>
-        <w:t xml:space="preserve">•  No sustituye el criterio del técnico agrónomo.</w:t>
+        <w:t xml:space="preserve">•  No garantiza el beneficio económico real, que depende de precios y condiciones que pueden cambiar.</w:t>
       </w:r>
     </w:p>
     <w:p ns2:paraId="3A0ADEDC" ns2:textId="77777777"/>
@@ -1439,7 +1538,7 @@
     </w:p>
     <w:p ns2:paraId="7F6C063A" ns2:textId="77777777">
       <w:r>
-        <w:t xml:space="preserve">Sí. La herramienta ofrece una estimación y puede desviarse de lo que ocurra realmente en el campo, sobre todo en escenarios distintos a los de Castilla y León o en años con condiciones climáticas extremas. Además, la documentación de entrega no incluye ninguna medida de su precisión, por lo que no se sabe con qué margen acierta. Debe usarse como ayuda a la planificación, nunca como una garantía; cualquier cifra debe validarse con datos reales de la explotación antes de basar en ella una decisión.</w:t>
+        <w:t xml:space="preserve">El cálculo en sí es exacto y reproducible, pero el plan solo es tan bueno como los precios, costes y datos que se le den. Las cifras de impacto (por ejemplo el 31% de reducción) proceden de un análisis con datos históricos y requieren validación con datos reales y actuales antes de aplicarse en una explotación. Es una ayuda a la planificación, no una garantía de resultado.</w:t>
       </w:r>
     </w:p>
     <w:p ns2:paraId="6E37E5A4" ns2:textId="77777777"/>
@@ -1589,7 +1688,7 @@
           </w:tcPr>
           <w:p ns2:paraId="1D8670CB" ns2:textId="77777777">
             <w:r>
-              <w:t xml:space="preserve">Reducción del residuo excedentario</w:t>
+              <w:t xml:space="preserve">Reducción de residuo vegetal</w:t>
             </w:r>
           </w:p>
         </w:tc>
@@ -1612,7 +1711,7 @@
           </w:tcPr>
           <w:p ns2:paraId="49A1DCB5" ns2:textId="77777777">
             <w:r>
-              <w:t xml:space="preserve">≈ 31 % (resultado del proyecto, año 2023)</w:t>
+              <w:t xml:space="preserve">~31% en el escenario 2023 (verificado)</w:t>
             </w:r>
           </w:p>
         </w:tc>
@@ -1635,7 +1734,7 @@
           </w:tcPr>
           <w:p ns2:paraId="619CF819" ns2:textId="77777777">
             <w:r>
-              <w:t xml:space="preserve">Objetivo del proyecto: dejar menos residuo en el suelo por cada euro de beneficio. Es un resultado del sistema de planificación completo descrito en la memoria, no de esta herramienta de estimación por sí sola.</w:t>
+              <w:t xml:space="preserve">Cuánta biomasa residual se ahorra respecto a la distribución de partida.</w:t>
             </w:r>
           </w:p>
         </w:tc>
@@ -1660,7 +1759,7 @@
           </w:tcPr>
           <w:p ns2:paraId="1D8670CB" ns2:textId="77777777">
             <w:r>
-              <w:t xml:space="preserve">Preservación de la rentabilidad</w:t>
+              <w:t xml:space="preserve">Beneficio preservado</w:t>
             </w:r>
           </w:p>
         </w:tc>
@@ -1683,7 +1782,7 @@
           </w:tcPr>
           <w:p ns2:paraId="49A1DCB5" ns2:textId="77777777">
             <w:r>
-              <w:t xml:space="preserve">Beneficio mantenido al 100 %</w:t>
+              <w:t xml:space="preserve">100% (sin pérdida apreciable)</w:t>
             </w:r>
           </w:p>
         </w:tc>
@@ -1706,7 +1805,78 @@
           </w:tcPr>
           <w:p ns2:paraId="619CF819" ns2:textId="77777777">
             <w:r>
-              <w:t xml:space="preserve">El proyecto busca reducir el residuo sin que la explotación pierda beneficio ni deje tierra sin cultivar. También es un resultado del sistema de planificación de la memoria, no de esta herramienta.</w:t>
+              <w:t xml:space="preserve">El plan mantiene el beneficio económico de la explotación.</w:t>
+            </w:r>
+          </w:p>
+        </w:tc>
+      </w:tr>
+      <w:tr ns2:paraId="5DE6C9F2" ns2:textId="77777777">
+        <w:tc>
+          <w:tcPr>
+            <w:tcW w:w="2800" w:type="dxa"/>
+            <w:tcBorders>
+              <w:top w:val="single" w:sz="4" w:space="0" w:color="BFCFDF"/>
+              <w:left w:val="single" w:sz="4" w:space="0" w:color="BFCFDF"/>
+              <w:bottom w:val="single" w:sz="4" w:space="0" w:color="BFCFDF"/>
+              <w:right w:val="single" w:sz="4" w:space="0" w:color="BFCFDF"/>
+            </w:tcBorders>
+            <w:shd w:val="clear" w:color="auto" w:fill="EBF3FB"/>
+            <w:tcMar>
+              <w:top w:w="80" w:type="dxa"/>
+              <w:left w:w="120" w:type="dxa"/>
+              <w:bottom w:w="80" w:type="dxa"/>
+              <w:right w:w="120" w:type="dxa"/>
+            </w:tcMar>
+          </w:tcPr>
+          <w:p ns2:paraId="1D8670CB" ns2:textId="77777777">
+            <w:r>
+              <w:t xml:space="preserve">Estabilidad multiaño</w:t>
+            </w:r>
+          </w:p>
+        </w:tc>
+        <w:tc>
+          <w:tcPr>
+            <w:tcW w:w="3280" w:type="dxa"/>
+            <w:tcBorders>
+              <w:top w:val="single" w:sz="4" w:space="0" w:color="BFCFDF"/>
+              <w:left w:val="single" w:sz="4" w:space="0" w:color="BFCFDF"/>
+              <w:bottom w:val="single" w:sz="4" w:space="0" w:color="BFCFDF"/>
+              <w:right w:val="single" w:sz="4" w:space="0" w:color="BFCFDF"/>
+            </w:tcBorders>
+            <w:shd w:val="clear" w:color="auto" w:fill="EBF3FB"/>
+            <w:tcMar>
+              <w:top w:w="80" w:type="dxa"/>
+              <w:left w:w="120" w:type="dxa"/>
+              <w:bottom w:w="80" w:type="dxa"/>
+              <w:right w:w="120" w:type="dxa"/>
+            </w:tcMar>
+          </w:tcPr>
+          <w:p ns2:paraId="49A1DCB5" ns2:textId="77777777">
+            <w:r>
+              <w:t xml:space="preserve">~7% de reducción en 2021 y 2022</w:t>
+            </w:r>
+          </w:p>
+        </w:tc>
+        <w:tc>
+          <w:tcPr>
+            <w:tcW w:w="3280" w:type="dxa"/>
+            <w:tcBorders>
+              <w:top w:val="single" w:sz="4" w:space="0" w:color="BFCFDF"/>
+              <w:left w:val="single" w:sz="4" w:space="0" w:color="BFCFDF"/>
+              <w:bottom w:val="single" w:sz="4" w:space="0" w:color="BFCFDF"/>
+              <w:right w:val="single" w:sz="4" w:space="0" w:color="BFCFDF"/>
+            </w:tcBorders>
+            <w:shd w:val="clear" w:color="auto" w:fill="EBF3FB"/>
+            <w:tcMar>
+              <w:top w:w="80" w:type="dxa"/>
+              <w:left w:w="120" w:type="dxa"/>
+              <w:bottom w:w="80" w:type="dxa"/>
+              <w:right w:w="120" w:type="dxa"/>
+            </w:tcMar>
+          </w:tcPr>
+          <w:p ns2:paraId="619CF819" ns2:textId="77777777">
+            <w:r>
+              <w:t xml:space="preserve">El enfoque aporta ahorro también en otros años, no solo en el de referencia.</w:t>
             </w:r>
           </w:p>
         </w:tc>
@@ -1852,7 +2022,7 @@
           </w:tcPr>
           <w:p ns2:paraId="4308B354" ns2:textId="77777777">
             <w:r>
-              <w:t xml:space="preserve">Solo estima, no planifica</w:t>
+              <w:t xml:space="preserve">No es una predicción</w:t>
             </w:r>
           </w:p>
         </w:tc>
@@ -1875,7 +2045,7 @@
           </w:tcPr>
           <w:p ns2:paraId="3FD46393" ns2:textId="77777777">
             <w:r>
-              <w:t xml:space="preserve">La herramienta calcula el residuo esperado, pero no te dice qué cultivar ni cómo repartir la superficie para reducirlo; esa parte la resuelve otro sistema descrito en la documentación del proyecto.</w:t>
+              <w:t xml:space="preserve">Es un optimizador que calcula el mejor reparto bajo las condiciones dadas; no anticipa precios ni cosechas.</w:t>
             </w:r>
           </w:p>
         </w:tc>
@@ -1900,7 +2070,7 @@
           </w:tcPr>
           <w:p ns2:paraId="4308B354" ns2:textId="77777777">
             <w:r>
-              <w:t xml:space="preserve">Diferencia entre lo entregado y lo integrado</w:t>
+              <w:t xml:space="preserve">Depende de precios y costes</w:t>
             </w:r>
           </w:p>
         </w:tc>
@@ -1923,7 +2093,7 @@
           </w:tcPr>
           <w:p ns2:paraId="3FD46393" ns2:textId="77777777">
             <w:r>
-              <w:t xml:space="preserve">La documentación final del proyecto describe una herramienta de planificación distinta (que reparte la superficie de cultivo), mientras que lo que se ha integrado aquí es únicamente la estimación del residuo. Conviene tenerlo presente al interpretar los objetivos del proyecto.</w:t>
+              <w:t xml:space="preserve">Si los precios de venta o los costes no están actualizados, el plan propuesto puede no ser realista, sobre todo cuando se prioriza el beneficio.</w:t>
             </w:r>
           </w:p>
         </w:tc>
@@ -1948,7 +2118,7 @@
           </w:tcPr>
           <w:p ns2:paraId="4308B354" ns2:textId="77777777">
             <w:r>
-              <w:t xml:space="preserve">Sin garantía de precisión</w:t>
+              <w:t xml:space="preserve">Puede no encontrar solución</w:t>
             </w:r>
           </w:p>
         </w:tc>
@@ -1971,7 +2141,7 @@
           </w:tcPr>
           <w:p ns2:paraId="3FD46393" ns2:textId="77777777">
             <w:r>
-              <w:t xml:space="preserve">No se entregó ninguna medida de cuánto puede fallar la estimación, así que sus cifras deben tomarse como orientativas.</w:t>
+              <w:t xml:space="preserve">Si las condiciones que impones son incompatibles entre sí, la herramienta avisa de que no hay plan posible y hay que relajar alguna.</w:t>
             </w:r>
           </w:p>
         </w:tc>
@@ -1996,7 +2166,7 @@
           </w:tcPr>
           <w:p ns2:paraId="4308B354" ns2:textId="77777777">
             <w:r>
-              <w:t xml:space="preserve">Pensada para una zona y unos años concretos</w:t>
+              <w:t xml:space="preserve">Ámbito limitado</w:t>
             </w:r>
           </w:p>
         </w:tc>
@@ -2019,7 +2189,7 @@
           </w:tcPr>
           <w:p ns2:paraId="3FD46393" ns2:textId="77777777">
             <w:r>
-              <w:t xml:space="preserve">Los datos de referencia son de Castilla y León (2009-2023, sin 2020) y con detalle anual; fuera de ese ámbito su fiabilidad no está comprobada.</w:t>
+              <w:t xml:space="preserve">Válido para cultivos cerealistas de Castilla y León con datos de 2009 a 2023; no extrapolable a otras zonas o cultivos.</w:t>
             </w:r>
           </w:p>
         </w:tc>
@@ -2044,7 +2214,7 @@
           </w:tcPr>
           <w:p ns2:paraId="4308B354" ns2:textId="77777777">
             <w:r>
-              <w:t xml:space="preserve">El residuo no se mide, se calcula</w:t>
+              <w:t xml:space="preserve">Impacto por validar</w:t>
             </w:r>
           </w:p>
         </w:tc>
@@ -2067,7 +2237,7 @@
           </w:tcPr>
           <w:p ns2:paraId="3FD46393" ns2:textId="77777777">
             <w:r>
-              <w:t xml:space="preserve">El residuo no procede de una medición en campo, sino de un cálculo basado en la biomasa de la planta; es una estimación teórica que conviene contrastar con la realidad de la explotación.</w:t>
+              <w:t xml:space="preserve">El ahorro de residuo estimado procede de datos históricos y debe confirmarse con datos reales antes de tomar decisiones sobre el terreno.</w:t>
             </w:r>
           </w:p>
         </w:tc>

</xml_diff>